<commit_message>
Reflejar la publicación del repositorio en GitHub
- README: instrucciones de clonado y estado real del repositorio
  (publicado; falta invitar a los integrantes).
- Matriz de requisitos (R24) y registro de progreso actualizados.
- Informe y presentación regenerados con el nuevo próximo paso.

Co-Authored-By: Claude Opus 5.5 <noreply@anthropic.com>
Claude-Session: https://claude.ai/code/session_01JFJDVcK6BUnGbmW9b6Es1K
</commit_message>
<xml_diff>
--- a/reports/informe/informe_PSMA00611.docx
+++ b/reports/informe/informe_PSMA00611.docx
@@ -16687,7 +16687,7 @@
         <w:pStyle w:val="Compact"/>
       </w:pPr>
       <w:r>
-        <w:t xml:space="preserve">Publicar el repositorio en GitHub desde las cuentas del equipo y registrar los aportes reales de cada integrante.</w:t>
+        <w:t xml:space="preserve">Invitar a los integrantes al repositorio de GitHub, ya publicado en https://github.com/CARLOSDELOSRIOS/aerolinea-bd-psma00611, y registrar los aportes reales de cada integrante.</w:t>
       </w:r>
     </w:p>
     <w:p>
@@ -19301,7 +19301,7 @@
               <w:jc w:val="left"/>
             </w:pPr>
             <w:r>
-              <w:t xml:space="preserve">Estructura del repositorio,</w:t>
+              <w:t xml:space="preserve">https://github.com/CARLOSDELOSRIOS/aerolinea-bd-psma00611,</w:t>
             </w:r>
             <w:r>
               <w:t xml:space="preserve"> </w:t>
@@ -19350,10 +19350,10 @@
                 <w:bCs/>
                 <w:b/>
               </w:rPr>
-              <w:t xml:space="preserve">Pendiente</w:t>
-            </w:r>
-            <w:r>
-              <w:t xml:space="preserve">: el repositorio está listo localmente; crear la organización o el repositorio y subirlo requiere cuentas del equipo y su autorización</w:t>
+              <w:t xml:space="preserve">Parcial</w:t>
+            </w:r>
+            <w:r>
+              <w:t xml:space="preserve">: publicado en la cuenta CARLOSDELOSRIOS; falta invitar a los integrantes y que cada uno registre sus aportes</w:t>
             </w:r>
           </w:p>
         </w:tc>

</xml_diff>

<commit_message>
Documento de avance del Producto Académico Colaborativo
- reports/avance/: fuente editable, DOCX y PDF (18 páginas) con el estado
  por componente del encargo, la verificación realizada, el plan de trabajo
  propuesto, los riesgos y las consultas para la retroalimentación.
- Comando `python -m aerolinea avance`, que reutiliza la plantilla y el
  proceso del informe final.
- Separación del texto que sigue a una tabla en ambos documentos.
- Carpetas de evidencias de la laptop y de Azure con su contenido esperado.

Co-Authored-By: Claude Opus 5.5 <noreply@anthropic.com>
Claude-Session: https://claude.ai/code/session_01JFJDVcK6BUnGbmW9b6Es1K
</commit_message>
<xml_diff>
--- a/reports/informe/informe_PSMA00611.docx
+++ b/reports/informe/informe_PSMA00611.docx
@@ -1250,6 +1250,7 @@
     <w:p>
       <w:pPr>
         <w:pStyle w:val="BodyText"/>
+        <w:spacing w:before="160"/>
       </w:pPr>
       <w:r>
         <w:t xml:space="preserve">La regla de 24 horas sigue la exigencia del Departamento de Transporte de Estados Unidos: para reservas hechas con al menos siete días de antelación, la aerolínea debe permitir mantenerlas sin pago o cancelarlas sin penalidad durante 24 horas (Customer Service Plan, 2026). Se modeló la segunda opción.</w:t>
@@ -1583,6 +1584,7 @@
     <w:p>
       <w:pPr>
         <w:pStyle w:val="BodyText"/>
+        <w:spacing w:before="160"/>
       </w:pPr>
       <w:r>
         <w:t xml:space="preserve">Trece supuestos (SUP-01 a SUP-13) completan lo que el enunciado no fija: por ejemplo, 72 horas como plazo para pagar una reserva, un tripulante de cabina por cada 50 asientos o que la base no impone los límites de horas de vuelo de la normativa aeronáutica, aunque una consulta los vigila.</w:t>
@@ -2603,6 +2605,7 @@
     <w:p>
       <w:pPr>
         <w:pStyle w:val="BodyText"/>
+        <w:spacing w:before="160"/>
       </w:pPr>
       <w:r>
         <w:t xml:space="preserve">Todas las relaciones con clave compuesta se revisaron para la segunda forma normal: en</w:t>
@@ -2994,6 +2997,7 @@
     <w:p>
       <w:pPr>
         <w:pStyle w:val="BodyText"/>
+        <w:spacing w:before="160"/>
       </w:pPr>
       <w:r>
         <w:t xml:space="preserve">Una decisión relacionada es</w:t>
@@ -5484,6 +5488,7 @@
     <w:p>
       <w:pPr>
         <w:pStyle w:val="BodyText"/>
+        <w:spacing w:before="160"/>
       </w:pPr>
       <w:r>
         <w:rPr>
@@ -6700,6 +6705,7 @@
     <w:p>
       <w:pPr>
         <w:pStyle w:val="BodyText"/>
+        <w:spacing w:before="160"/>
       </w:pPr>
       <w:r>
         <w:t xml:space="preserve">El generador incluye a propósito casos difíciles: compras sin registro, viajes de ida y vuelta, pagos en dos o tres partes, pagos rechazados, reservas que vencen, cancelaciones dentro de las 24 horas, cancelaciones de vuelos, demoras propagadas por avión, no presentados, mantenimiento programado con avión de reserva, cambio de horario del 1 de noviembre y llegadas al día siguiente. Los archivos CSV generados tienen una huella SHA-256 registrada en un manifiesto, de modo que cualquier ejecución con la misma semilla puede comprobarse byte a byte.</w:t>
@@ -7001,6 +7007,7 @@
     <w:p>
       <w:pPr>
         <w:pStyle w:val="BodyText"/>
+        <w:spacing w:before="160"/>
       </w:pPr>
       <w:r>
         <w:t xml:space="preserve">Una prueba se declara superada solo si se observó su resultado. Las pruebas crean sus escenarios en vuelos reservados para ese fin y los eliminan al terminar, sin alterar los datos analizados.</w:t>

</xml_diff>

<commit_message>
Avance del PAC: índices, diagramas, trabajo en equipo y prompts
- Documento de avance reescrito en un tono más cercano, con índice
  general, índice de figuras e índice de tablas, 19 figuras (16 diagramas
  nuevos generados por src/aerolinea/figuras_avance.py), sección de trabajo
  en equipo, árbol de archivos (anexo A), prompts literales (anexo B) y
  borrador de declaración de uso de IA (anexo C).
- docs/equipo/prompts.json: prompts y respuestas copiados del registro de
  la sesión, sin editar.
- Carátulas del informe, del avance y de la presentación con los
  integrantes, los docentes y el líder; registro de aportes con la
  declaración del equipo.
- Los índices del DOCX se guardan ya calculados y se ven sin actualizar
  campos; el informe final titula «Índice» a su tabla de contenido.

Co-Authored-By: Claude Opus 5.5 <noreply@anthropic.com>
Claude-Session: https://claude.ai/code/session_01JFJDVcK6BUnGbmW9b6Es1K
</commit_message>
<xml_diff>
--- a/reports/informe/informe_PSMA00611.docx
+++ b/reports/informe/informe_PSMA00611.docx
@@ -55,7 +55,7 @@
         <w:pStyle w:val="PortadaDatos"/>
       </w:pPr>
       <w:r>
-        <w:t xml:space="preserve">Integrantes que participaron activamente: [POR COMPLETAR]</w:t>
+        <w:t xml:space="preserve">Integrantes que participaron activamente:</w:t>
       </w:r>
     </w:p>
     <w:p>
@@ -63,7 +63,7 @@
         <w:pStyle w:val="PortadaDatos"/>
       </w:pPr>
       <w:r>
-        <w:t xml:space="preserve">Docente: [POR COMPLETAR]</w:t>
+        <w:t xml:space="preserve">Carlos Veliz de Villa Aguirre</w:t>
       </w:r>
     </w:p>
     <w:p>
@@ -71,7 +71,7 @@
         <w:pStyle w:val="PortadaDatos"/>
       </w:pPr>
       <w:r>
-        <w:t xml:space="preserve">Sección / NRC: [POR COMPLETAR]</w:t>
+        <w:t xml:space="preserve">Elias Sifuentes Valles</w:t>
       </w:r>
     </w:p>
     <w:p>
@@ -79,7 +79,7 @@
         <w:pStyle w:val="PortadaDatos"/>
       </w:pPr>
       <w:r>
-        <w:t xml:space="preserve">Líder del equipo (entrega en el aula virtual): [POR COMPLETAR]</w:t>
+        <w:t xml:space="preserve">Carlos De los Ríos De la Roca</w:t>
       </w:r>
     </w:p>
     <w:p>
@@ -87,20 +87,44 @@
         <w:pStyle w:val="PortadaDatos"/>
       </w:pPr>
       <w:r>
-        <w:t xml:space="preserve">Lugar y fecha: [POR COMPLETAR], noviembre de 2026</w:t>
+        <w:t xml:space="preserve">Docentes: Walter Alejandro Silva Sotillo y Max Leoncio Mucha Morales</w:t>
       </w:r>
     </w:p>
     <w:p>
-      <w:r>
-        <w:br w:type="page"/>
+      <w:pPr>
+        <w:pStyle w:val="PortadaDatos"/>
+      </w:pPr>
+      <w:r>
+        <w:t xml:space="preserve">Sección / NRC: [POR COMPLETAR]</w:t>
       </w:r>
     </w:p>
     <w:p>
       <w:pPr>
+        <w:pStyle w:val="PortadaDatos"/>
+      </w:pPr>
+      <w:r>
+        <w:t xml:space="preserve">Líder del equipo (entrega en el aula virtual): Carlos De los Ríos De la Roca</w:t>
+      </w:r>
+    </w:p>
+    <w:p>
+      <w:pPr>
+        <w:pStyle w:val="PortadaDatos"/>
+      </w:pPr>
+      <w:r>
+        <w:t xml:space="preserve">Lugar y fecha: [POR COMPLETAR], noviembre de 2026</w:t>
+      </w:r>
+    </w:p>
+    <w:p>
+      <w:r>
+        <w:br w:type="page"/>
+      </w:r>
+    </w:p>
+    <w:p>
+      <w:pPr>
         <w:pStyle w:val="TituloIndice"/>
       </w:pPr>
       <w:r>
-        <w:t xml:space="preserve">Contenido</w:t>
+        <w:t xml:space="preserve">Índice</w:t>
       </w:r>
     </w:p>
     <w:sdt>
@@ -112,8 +136,11 @@
       </w:sdtPr>
       <w:sdtContent>
         <w:p>
+          <w:pPr>
+            <w:pStyle w:val="TOC1"/>
+          </w:pPr>
           <w:r>
-            <w:fldChar w:fldCharType="begin" w:dirty="true"/>
+            <w:fldChar w:fldCharType="begin"/>
           </w:r>
           <w:r>
             <w:instrText xml:space="preserve"> TOC \o "1-2" \h \z \u </w:instrText>
@@ -122,7 +149,629 @@
             <w:fldChar w:fldCharType="separate"/>
           </w:r>
           <w:r>
-            <w:t>Actualice el índice: clic derecho y «Actualizar campo».</w:t>
+            <w:t xml:space="preserve">Resumen ejecutivo</w:t>
+          </w:r>
+          <w:r>
+            <w:tab/>
+          </w:r>
+          <w:r>
+            <w:t>3</w:t>
+          </w:r>
+        </w:p>
+        <w:p>
+          <w:pPr>
+            <w:pStyle w:val="TOC1"/>
+          </w:pPr>
+          <w:r>
+            <w:t xml:space="preserve">Problema, objetivos y alcance</w:t>
+          </w:r>
+          <w:r>
+            <w:tab/>
+          </w:r>
+          <w:r>
+            <w:t>4</w:t>
+          </w:r>
+        </w:p>
+        <w:p>
+          <w:pPr>
+            <w:pStyle w:val="TOC2"/>
+          </w:pPr>
+          <w:r>
+            <w:t xml:space="preserve">Problema</w:t>
+          </w:r>
+          <w:r>
+            <w:tab/>
+          </w:r>
+          <w:r>
+            <w:t>4</w:t>
+          </w:r>
+        </w:p>
+        <w:p>
+          <w:pPr>
+            <w:pStyle w:val="TOC2"/>
+          </w:pPr>
+          <w:r>
+            <w:t xml:space="preserve">Objetivos</w:t>
+          </w:r>
+          <w:r>
+            <w:tab/>
+          </w:r>
+          <w:r>
+            <w:t>4</w:t>
+          </w:r>
+        </w:p>
+        <w:p>
+          <w:pPr>
+            <w:pStyle w:val="TOC2"/>
+          </w:pPr>
+          <w:r>
+            <w:t xml:space="preserve">Alcance</w:t>
+          </w:r>
+          <w:r>
+            <w:tab/>
+          </w:r>
+          <w:r>
+            <w:t>5</w:t>
+          </w:r>
+        </w:p>
+        <w:p>
+          <w:pPr>
+            <w:pStyle w:val="TOC1"/>
+          </w:pPr>
+          <w:r>
+            <w:t xml:space="preserve">Requisitos y reglas de negocio</w:t>
+          </w:r>
+          <w:r>
+            <w:tab/>
+          </w:r>
+          <w:r>
+            <w:t>6</w:t>
+          </w:r>
+        </w:p>
+        <w:p>
+          <w:pPr>
+            <w:pStyle w:val="TOC2"/>
+          </w:pPr>
+          <w:r>
+            <w:t xml:space="preserve">Fuentes y discrepancias</w:t>
+          </w:r>
+          <w:r>
+            <w:tab/>
+          </w:r>
+          <w:r>
+            <w:t>6</w:t>
+          </w:r>
+        </w:p>
+        <w:p>
+          <w:pPr>
+            <w:pStyle w:val="TOC2"/>
+          </w:pPr>
+          <w:r>
+            <w:t xml:space="preserve">Actores y casos de uso</w:t>
+          </w:r>
+          <w:r>
+            <w:tab/>
+          </w:r>
+          <w:r>
+            <w:t>6</w:t>
+          </w:r>
+        </w:p>
+        <w:p>
+          <w:pPr>
+            <w:pStyle w:val="TOC2"/>
+          </w:pPr>
+          <w:r>
+            <w:t xml:space="preserve">Decisiones de dominio</w:t>
+          </w:r>
+          <w:r>
+            <w:tab/>
+          </w:r>
+          <w:r>
+            <w:t>6</w:t>
+          </w:r>
+        </w:p>
+        <w:p>
+          <w:pPr>
+            <w:pStyle w:val="TOC2"/>
+          </w:pPr>
+          <w:r>
+            <w:t xml:space="preserve">Reglas verificables</w:t>
+          </w:r>
+          <w:r>
+            <w:tab/>
+          </w:r>
+          <w:r>
+            <w:t>7</w:t>
+          </w:r>
+        </w:p>
+        <w:p>
+          <w:pPr>
+            <w:pStyle w:val="TOC1"/>
+          </w:pPr>
+          <w:r>
+            <w:t xml:space="preserve">Fundamentos conceptuales</w:t>
+          </w:r>
+          <w:r>
+            <w:tab/>
+          </w:r>
+          <w:r>
+            <w:t>8</w:t>
+          </w:r>
+        </w:p>
+        <w:p>
+          <w:pPr>
+            <w:pStyle w:val="TOC1"/>
+          </w:pPr>
+          <w:r>
+            <w:t xml:space="preserve">Modelado y normalización</w:t>
+          </w:r>
+          <w:r>
+            <w:tab/>
+          </w:r>
+          <w:r>
+            <w:t>10</w:t>
+          </w:r>
+        </w:p>
+        <w:p>
+          <w:pPr>
+            <w:pStyle w:val="TOC2"/>
+          </w:pPr>
+          <w:r>
+            <w:t xml:space="preserve">Modelo conceptual</w:t>
+          </w:r>
+          <w:r>
+            <w:tab/>
+          </w:r>
+          <w:r>
+            <w:t>10</w:t>
+          </w:r>
+        </w:p>
+        <w:p>
+          <w:pPr>
+            <w:pStyle w:val="TOC2"/>
+          </w:pPr>
+          <w:r>
+            <w:t xml:space="preserve">Modelo lógico</w:t>
+          </w:r>
+          <w:r>
+            <w:tab/>
+          </w:r>
+          <w:r>
+            <w:t>11</w:t>
+          </w:r>
+        </w:p>
+        <w:p>
+          <w:pPr>
+            <w:pStyle w:val="TOC2"/>
+          </w:pPr>
+          <w:r>
+            <w:t xml:space="preserve">Normalización</w:t>
+          </w:r>
+          <w:r>
+            <w:tab/>
+          </w:r>
+          <w:r>
+            <w:t>15</w:t>
+          </w:r>
+        </w:p>
+        <w:p>
+          <w:pPr>
+            <w:pStyle w:val="TOC2"/>
+          </w:pPr>
+          <w:r>
+            <w:t xml:space="preserve">Desnormalizaciones controladas</w:t>
+          </w:r>
+          <w:r>
+            <w:tab/>
+          </w:r>
+          <w:r>
+            <w:t>16</w:t>
+          </w:r>
+        </w:p>
+        <w:p>
+          <w:pPr>
+            <w:pStyle w:val="TOC1"/>
+          </w:pPr>
+          <w:r>
+            <w:t xml:space="preserve">Diccionario de datos</w:t>
+          </w:r>
+          <w:r>
+            <w:tab/>
+          </w:r>
+          <w:r>
+            <w:t>18</w:t>
+          </w:r>
+        </w:p>
+        <w:p>
+          <w:pPr>
+            <w:pStyle w:val="TOC1"/>
+          </w:pPr>
+          <w:r>
+            <w:t xml:space="preserve">Arquitectura local y en la nube</w:t>
+          </w:r>
+          <w:r>
+            <w:tab/>
+          </w:r>
+          <w:r>
+            <w:t>20</w:t>
+          </w:r>
+        </w:p>
+        <w:p>
+          <w:pPr>
+            <w:pStyle w:val="TOC1"/>
+          </w:pPr>
+          <w:r>
+            <w:t xml:space="preserve">Implementación SQL y Python</w:t>
+          </w:r>
+          <w:r>
+            <w:tab/>
+          </w:r>
+          <w:r>
+            <w:t>22</w:t>
+          </w:r>
+        </w:p>
+        <w:p>
+          <w:pPr>
+            <w:pStyle w:val="TOC2"/>
+          </w:pPr>
+          <w:r>
+            <w:t xml:space="preserve">Scripts T-SQL</w:t>
+          </w:r>
+          <w:r>
+            <w:tab/>
+          </w:r>
+          <w:r>
+            <w:t>22</w:t>
+          </w:r>
+        </w:p>
+        <w:p>
+          <w:pPr>
+            <w:pStyle w:val="TOC2"/>
+          </w:pPr>
+          <w:r>
+            <w:t xml:space="preserve">Reglas en el motor</w:t>
+          </w:r>
+          <w:r>
+            <w:tab/>
+          </w:r>
+          <w:r>
+            <w:t>22</w:t>
+          </w:r>
+        </w:p>
+        <w:p>
+          <w:pPr>
+            <w:pStyle w:val="TOC2"/>
+          </w:pPr>
+          <w:r>
+            <w:t xml:space="preserve">Control de concurrencia</w:t>
+          </w:r>
+          <w:r>
+            <w:tab/>
+          </w:r>
+          <w:r>
+            <w:t>22</w:t>
+          </w:r>
+        </w:p>
+        <w:p>
+          <w:pPr>
+            <w:pStyle w:val="TOC2"/>
+          </w:pPr>
+          <w:r>
+            <w:t xml:space="preserve">Procedimientos de negocio</w:t>
+          </w:r>
+          <w:r>
+            <w:tab/>
+          </w:r>
+          <w:r>
+            <w:t>23</w:t>
+          </w:r>
+        </w:p>
+        <w:p>
+          <w:pPr>
+            <w:pStyle w:val="TOC2"/>
+          </w:pPr>
+          <w:r>
+            <w:t xml:space="preserve">Aplicación de Python</w:t>
+          </w:r>
+          <w:r>
+            <w:tab/>
+          </w:r>
+          <w:r>
+            <w:t>23</w:t>
+          </w:r>
+        </w:p>
+        <w:p>
+          <w:pPr>
+            <w:pStyle w:val="TOC1"/>
+          </w:pPr>
+          <w:r>
+            <w:t xml:space="preserve">Datos y metodología de validación</w:t>
+          </w:r>
+          <w:r>
+            <w:tab/>
+          </w:r>
+          <w:r>
+            <w:t>25</w:t>
+          </w:r>
+        </w:p>
+        <w:p>
+          <w:pPr>
+            <w:pStyle w:val="TOC2"/>
+          </w:pPr>
+          <w:r>
+            <w:t xml:space="preserve">Datos sintéticos reproducibles</w:t>
+          </w:r>
+          <w:r>
+            <w:tab/>
+          </w:r>
+          <w:r>
+            <w:t>25</w:t>
+          </w:r>
+        </w:p>
+        <w:p>
+          <w:pPr>
+            <w:pStyle w:val="TOC2"/>
+          </w:pPr>
+          <w:r>
+            <w:t xml:space="preserve">Niveles de prueba</w:t>
+          </w:r>
+          <w:r>
+            <w:tab/>
+          </w:r>
+          <w:r>
+            <w:t>25</w:t>
+          </w:r>
+        </w:p>
+        <w:p>
+          <w:pPr>
+            <w:pStyle w:val="TOC1"/>
+          </w:pPr>
+          <w:r>
+            <w:t xml:space="preserve">Resultados y discusión</w:t>
+          </w:r>
+          <w:r>
+            <w:tab/>
+          </w:r>
+          <w:r>
+            <w:t>27</w:t>
+          </w:r>
+        </w:p>
+        <w:p>
+          <w:pPr>
+            <w:pStyle w:val="TOC2"/>
+          </w:pPr>
+          <w:r>
+            <w:t xml:space="preserve">Resultados de las pruebas</w:t>
+          </w:r>
+          <w:r>
+            <w:tab/>
+          </w:r>
+          <w:r>
+            <w:t>27</w:t>
+          </w:r>
+        </w:p>
+        <w:p>
+          <w:pPr>
+            <w:pStyle w:val="TOC2"/>
+          </w:pPr>
+          <w:r>
+            <w:t xml:space="preserve">Hallazgos del desarrollo</w:t>
+          </w:r>
+          <w:r>
+            <w:tab/>
+          </w:r>
+          <w:r>
+            <w:t>28</w:t>
+          </w:r>
+        </w:p>
+        <w:p>
+          <w:pPr>
+            <w:pStyle w:val="TOC2"/>
+          </w:pPr>
+          <w:r>
+            <w:t xml:space="preserve">Resultados de las consultas</w:t>
+          </w:r>
+          <w:r>
+            <w:tab/>
+          </w:r>
+          <w:r>
+            <w:t>28</w:t>
+          </w:r>
+        </w:p>
+        <w:p>
+          <w:pPr>
+            <w:pStyle w:val="TOC2"/>
+          </w:pPr>
+          <w:r>
+            <w:t xml:space="preserve">Discusión</w:t>
+          </w:r>
+          <w:r>
+            <w:tab/>
+          </w:r>
+          <w:r>
+            <w:t>37</w:t>
+          </w:r>
+        </w:p>
+        <w:p>
+          <w:pPr>
+            <w:pStyle w:val="TOC1"/>
+          </w:pPr>
+          <w:r>
+            <w:t xml:space="preserve">Seguridad, limitaciones y trabajo futuro</w:t>
+          </w:r>
+          <w:r>
+            <w:tab/>
+          </w:r>
+          <w:r>
+            <w:t>38</w:t>
+          </w:r>
+        </w:p>
+        <w:p>
+          <w:pPr>
+            <w:pStyle w:val="TOC2"/>
+          </w:pPr>
+          <w:r>
+            <w:t xml:space="preserve">Seguridad</w:t>
+          </w:r>
+          <w:r>
+            <w:tab/>
+          </w:r>
+          <w:r>
+            <w:t>38</w:t>
+          </w:r>
+        </w:p>
+        <w:p>
+          <w:pPr>
+            <w:pStyle w:val="TOC2"/>
+          </w:pPr>
+          <w:r>
+            <w:t xml:space="preserve">Limitaciones</w:t>
+          </w:r>
+          <w:r>
+            <w:tab/>
+          </w:r>
+          <w:r>
+            <w:t>38</w:t>
+          </w:r>
+        </w:p>
+        <w:p>
+          <w:pPr>
+            <w:pStyle w:val="TOC2"/>
+          </w:pPr>
+          <w:r>
+            <w:t xml:space="preserve">Trabajo futuro</w:t>
+          </w:r>
+          <w:r>
+            <w:tab/>
+          </w:r>
+          <w:r>
+            <w:t>38</w:t>
+          </w:r>
+        </w:p>
+        <w:p>
+          <w:pPr>
+            <w:pStyle w:val="TOC1"/>
+          </w:pPr>
+          <w:r>
+            <w:t xml:space="preserve">Conclusiones</w:t>
+          </w:r>
+          <w:r>
+            <w:tab/>
+          </w:r>
+          <w:r>
+            <w:t>40</w:t>
+          </w:r>
+        </w:p>
+        <w:p>
+          <w:pPr>
+            <w:pStyle w:val="TOC1"/>
+          </w:pPr>
+          <w:r>
+            <w:t xml:space="preserve">Recomendaciones</w:t>
+          </w:r>
+          <w:r>
+            <w:tab/>
+          </w:r>
+          <w:r>
+            <w:t>41</w:t>
+          </w:r>
+        </w:p>
+        <w:p>
+          <w:pPr>
+            <w:pStyle w:val="TOC1"/>
+          </w:pPr>
+          <w:r>
+            <w:t xml:space="preserve">Referencias</w:t>
+          </w:r>
+          <w:r>
+            <w:tab/>
+          </w:r>
+          <w:r>
+            <w:t>42</w:t>
+          </w:r>
+        </w:p>
+        <w:p>
+          <w:pPr>
+            <w:pStyle w:val="TOC1"/>
+          </w:pPr>
+          <w:r>
+            <w:t xml:space="preserve">Anexos</w:t>
+          </w:r>
+          <w:r>
+            <w:tab/>
+          </w:r>
+          <w:r>
+            <w:t>44</w:t>
+          </w:r>
+        </w:p>
+        <w:p>
+          <w:pPr>
+            <w:pStyle w:val="TOC2"/>
+          </w:pPr>
+          <w:r>
+            <w:t xml:space="preserve">Anexo A. Matriz de trazabilidad</w:t>
+          </w:r>
+          <w:r>
+            <w:tab/>
+          </w:r>
+          <w:r>
+            <w:t>44</w:t>
+          </w:r>
+        </w:p>
+        <w:p>
+          <w:pPr>
+            <w:pStyle w:val="TOC2"/>
+          </w:pPr>
+          <w:r>
+            <w:t xml:space="preserve">Anexo B. Hallazgos corregidos durante el desarrollo</w:t>
+          </w:r>
+          <w:r>
+            <w:tab/>
+          </w:r>
+          <w:r>
+            <w:t>46</w:t>
+          </w:r>
+        </w:p>
+        <w:p>
+          <w:pPr>
+            <w:pStyle w:val="TOC2"/>
+          </w:pPr>
+          <w:r>
+            <w:t xml:space="preserve">Anexo C. Modelo físico del área de ventas</w:t>
+          </w:r>
+          <w:r>
+            <w:tab/>
+          </w:r>
+          <w:r>
+            <w:t>48</w:t>
+          </w:r>
+        </w:p>
+        <w:p>
+          <w:pPr>
+            <w:pStyle w:val="TOC2"/>
+          </w:pPr>
+          <w:r>
+            <w:t xml:space="preserve">Anexo D. Reproducción y archivos</w:t>
+          </w:r>
+          <w:r>
+            <w:tab/>
+          </w:r>
+          <w:r>
+            <w:t>49</w:t>
+          </w:r>
+        </w:p>
+        <w:p>
+          <w:pPr>
+            <w:pStyle w:val="TOC2"/>
+          </w:pPr>
+          <w:r>
+            <w:t xml:space="preserve">Anexo E. Declaración sobre el uso de herramientas y datos</w:t>
+          </w:r>
+          <w:r>
+            <w:tab/>
+          </w:r>
+          <w:r>
+            <w:t>50</w:t>
           </w:r>
           <w:r>
             <w:fldChar w:fldCharType="end"/>
@@ -19615,7 +20264,7 @@
               <w:jc w:val="left"/>
             </w:pPr>
             <w:r>
-              <w:t xml:space="preserve">Portada del informe</w:t>
+              <w:t xml:space="preserve">Portadas del informe, del avance y de la presentación</w:t>
             </w:r>
           </w:p>
         </w:tc>
@@ -19631,19 +20280,10 @@
                 <w:bCs/>
                 <w:b/>
               </w:rPr>
-              <w:t xml:space="preserve">Pendiente</w:t>
-            </w:r>
-            <w:r>
-              <w:t xml:space="preserve">: nombres</w:t>
-            </w:r>
-            <w:r>
-              <w:t xml:space="preserve"> </w:t>
-            </w:r>
-            <w:r>
-              <w:rPr>
-                <w:rStyle w:val="VerbatimChar"/>
-              </w:rPr>
-              <w:t xml:space="preserve">[POR COMPLETAR]</w:t>
+              <w:t xml:space="preserve">Parcial</w:t>
+            </w:r>
+            <w:r>
+              <w:t xml:space="preserve">: integrantes, docentes y líder (Carlos De los Ríos De la Roca) completados; falta sección/NRC, lugar y fecha</w:t>
             </w:r>
           </w:p>
         </w:tc>
@@ -24183,6 +24823,53 @@
       <w:szCs w:val="20"/>
     </w:rPr>
   </w:style>
+  <w:style w:customStyle="1" w:styleId="TOC3" w:type="paragraph">
+    <w:name w:val="toc 3"/>
+    <w:basedOn w:val="Normal"/>
+    <w:qFormat/>
+    <w:pPr>
+      <w:tabs>
+        <w:tab w:leader="dot" w:pos="9060" w:val="right"/>
+      </w:tabs>
+      <w:spacing w:after="60" w:before="0"/>
+    </w:pPr>
+    <w:rPr>
+      <w:sz w:val="20"/>
+      <w:szCs w:val="20"/>
+    </w:rPr>
+  </w:style>
+  <w:style w:customStyle="1" w:styleId="FuenteFigura" w:type="paragraph">
+    <w:name w:val="Fuente Figura"/>
+    <w:basedOn w:val="Normal"/>
+    <w:qFormat/>
+    <w:pPr>
+      <w:spacing w:after="240" w:before="0" w:line="240" w:lineRule="auto"/>
+      <w:jc w:val="center"/>
+    </w:pPr>
+    <w:rPr>
+      <w:color w:val="52514E"/>
+      <w:sz w:val="16"/>
+      <w:szCs w:val="16"/>
+    </w:rPr>
+  </w:style>
+  <w:style w:customStyle="1" w:styleId="Prompt" w:type="paragraph">
+    <w:name w:val="Prompt"/>
+    <w:basedOn w:val="Normal"/>
+    <w:qFormat/>
+    <w:pPr>
+      <w:pBdr>
+        <w:left w:color="256ABF" w:space="8" w:sz="18" w:val="single"/>
+      </w:pBdr>
+      <w:shd w:color="auto" w:fill="F3F6FB" w:val="clear"/>
+      <w:spacing w:after="100" w:before="0" w:line="260" w:lineRule="auto"/>
+      <w:ind w:left="340" w:right="113"/>
+    </w:pPr>
+    <w:rPr>
+      <w:color w:val="262626"/>
+      <w:sz w:val="19"/>
+      <w:szCs w:val="19"/>
+    </w:rPr>
+  </w:style>
   <w:style w:type="character" w:customStyle="1" w:styleId="KeywordTok">
     <w:name w:val="KeywordTok"/>
     <w:basedOn w:val="VerbatimChar"/>

</xml_diff>